<commit_message>
Round 12b: record the remaining formatting checklist in the self-check
</commit_message>
<xml_diff>
--- a/重构版论文_v4_20260915/论文自查表.docx
+++ b/重构版论文_v4_20260915/论文自查表.docx
@@ -8565,7 +8565,7 @@
               <w:rPr>
                 <w:sz w:val="16"/>
               </w:rPr>
-              <w:t xml:space="preserve">（四面板：协议、十种子等价、机制、协议效应）与 </w:t>
+              <w:t xml:space="preserve">（四面板：协议、十种子等价、机制、协议效应，3300×2280 像素）与 </w:t>
             </w:r>
             <w:r>
               <w:rPr>
@@ -8578,14 +8578,20 @@
               <w:rPr>
                 <w:sz w:val="16"/>
               </w:rPr>
-              <w:t>；</w:t>
+              <w:t>；公式已按 (1)–(5) 编号。</w:t>
             </w:r>
             <w:r>
               <w:rPr>
                 <w:b/>
                 <w:sz w:val="16"/>
               </w:rPr>
-              <w:t>尚余按 JISA 官方模板排版</w:t>
+              <w:t>尚余排版项</w:t>
+            </w:r>
+            <w:r>
+              <w:rPr>
+                <w:sz w:val="16"/>
+              </w:rPr>
+              <w:t>：① 套用 JISA 官方模板（单栏）；② 用 Word 公式编辑器的 LaTeX 模式把 5 个公式从 LaTeX 源码转为原生公式；③ 表格改为仅横线（本刊要求避免竖线）；④ 填入作者与单位信息</w:t>
             </w:r>
           </w:p>
         </w:tc>

</xml_diff>

<commit_message>
Round 13b: cross-reference checks and isolation of retired evidence
</commit_message>
<xml_diff>
--- a/重构版论文_v4_20260915/论文自查表.docx
+++ b/重构版论文_v4_20260915/论文自查表.docx
@@ -6960,7 +6960,20 @@
               <w:rPr>
                 <w:sz w:val="16"/>
               </w:rPr>
-              <w:t>图 1–11、表 1–7 连续无缺无重；中英一致；引用的图片文件全部存在</w:t>
+              <w:t>图 1–11、表 1–7 连续无缺无重；中英一致；引用的图片文件全部存在；</w:t>
+            </w:r>
+            <w:r>
+              <w:rPr>
+                <w:rFonts w:ascii="Consolas" w:hAnsi="Consolas"/>
+                <w:sz w:val="16"/>
+              </w:rPr>
+              <w:t>scripts/check_section_refs_v32.py</w:t>
+            </w:r>
+            <w:r>
+              <w:rPr>
+                <w:sz w:val="16"/>
+              </w:rPr>
+              <w:t xml:space="preserve"> 另校验 15 处（英文）/ 9 处（中文）章节引用与 (1)–(5) 公式引用均指向真实目标</w:t>
             </w:r>
           </w:p>
         </w:tc>

</xml_diff>

<commit_message>
Round 16: equations and tables typeset for submission (OMML, three-line tables)
</commit_message>
<xml_diff>
--- a/重构版论文_v4_20260915/论文自查表.docx
+++ b/重构版论文_v4_20260915/论文自查表.docx
@@ -140,6 +140,14 @@
         <w:tblStyle w:val="TableGrid"/>
         <w:tblW w:type="auto" w:w="0"/>
         <w:tblLook w:firstColumn="1" w:firstRow="1" w:lastColumn="0" w:lastRow="0" w:noHBand="0" w:noVBand="1" w:val="04A0"/>
+        <w:tblBorders>
+          <w:top w:val="single" w:sz="6" w:space="0" w:color="000000"/>
+          <w:left w:val="none" w:sz="0" w:space="0" w:color="auto"/>
+          <w:bottom w:val="single" w:sz="6" w:space="0" w:color="000000"/>
+          <w:right w:val="none" w:sz="0" w:space="0" w:color="auto"/>
+          <w:insideH w:val="single" w:sz="6" w:space="0" w:color="000000"/>
+          <w:insideV w:val="none" w:sz="0" w:space="0" w:color="auto"/>
+        </w:tblBorders>
       </w:tblPr>
       <w:tblGrid>
         <w:gridCol w:w="1958"/>
@@ -1163,6 +1171,14 @@
         <w:tblStyle w:val="TableGrid"/>
         <w:tblW w:type="auto" w:w="0"/>
         <w:tblLook w:firstColumn="1" w:firstRow="1" w:lastColumn="0" w:lastRow="0" w:noHBand="0" w:noVBand="1" w:val="04A0"/>
+        <w:tblBorders>
+          <w:top w:val="single" w:sz="6" w:space="0" w:color="000000"/>
+          <w:left w:val="none" w:sz="0" w:space="0" w:color="auto"/>
+          <w:bottom w:val="single" w:sz="6" w:space="0" w:color="000000"/>
+          <w:right w:val="none" w:sz="0" w:space="0" w:color="auto"/>
+          <w:insideH w:val="single" w:sz="6" w:space="0" w:color="000000"/>
+          <w:insideV w:val="none" w:sz="0" w:space="0" w:color="auto"/>
+        </w:tblBorders>
       </w:tblPr>
       <w:tblGrid>
         <w:gridCol w:w="1958"/>
@@ -1729,6 +1745,14 @@
         <w:tblStyle w:val="TableGrid"/>
         <w:tblW w:type="auto" w:w="0"/>
         <w:tblLook w:firstColumn="1" w:firstRow="1" w:lastColumn="0" w:lastRow="0" w:noHBand="0" w:noVBand="1" w:val="04A0"/>
+        <w:tblBorders>
+          <w:top w:val="single" w:sz="6" w:space="0" w:color="000000"/>
+          <w:left w:val="none" w:sz="0" w:space="0" w:color="auto"/>
+          <w:bottom w:val="single" w:sz="6" w:space="0" w:color="000000"/>
+          <w:right w:val="none" w:sz="0" w:space="0" w:color="auto"/>
+          <w:insideH w:val="single" w:sz="6" w:space="0" w:color="000000"/>
+          <w:insideV w:val="none" w:sz="0" w:space="0" w:color="auto"/>
+        </w:tblBorders>
       </w:tblPr>
       <w:tblGrid>
         <w:gridCol w:w="1958"/>
@@ -2408,6 +2432,14 @@
         <w:tblStyle w:val="TableGrid"/>
         <w:tblW w:type="auto" w:w="0"/>
         <w:tblLook w:firstColumn="1" w:firstRow="1" w:lastColumn="0" w:lastRow="0" w:noHBand="0" w:noVBand="1" w:val="04A0"/>
+        <w:tblBorders>
+          <w:top w:val="single" w:sz="6" w:space="0" w:color="000000"/>
+          <w:left w:val="none" w:sz="0" w:space="0" w:color="auto"/>
+          <w:bottom w:val="single" w:sz="6" w:space="0" w:color="000000"/>
+          <w:right w:val="none" w:sz="0" w:space="0" w:color="auto"/>
+          <w:insideH w:val="single" w:sz="6" w:space="0" w:color="000000"/>
+          <w:insideV w:val="none" w:sz="0" w:space="0" w:color="auto"/>
+        </w:tblBorders>
       </w:tblPr>
       <w:tblGrid>
         <w:gridCol w:w="1958"/>
@@ -3202,6 +3234,14 @@
         <w:tblStyle w:val="TableGrid"/>
         <w:tblW w:type="auto" w:w="0"/>
         <w:tblLook w:firstColumn="1" w:firstRow="1" w:lastColumn="0" w:lastRow="0" w:noHBand="0" w:noVBand="1" w:val="04A0"/>
+        <w:tblBorders>
+          <w:top w:val="single" w:sz="6" w:space="0" w:color="000000"/>
+          <w:left w:val="none" w:sz="0" w:space="0" w:color="auto"/>
+          <w:bottom w:val="single" w:sz="6" w:space="0" w:color="000000"/>
+          <w:right w:val="none" w:sz="0" w:space="0" w:color="auto"/>
+          <w:insideH w:val="single" w:sz="6" w:space="0" w:color="000000"/>
+          <w:insideV w:val="none" w:sz="0" w:space="0" w:color="auto"/>
+        </w:tblBorders>
       </w:tblPr>
       <w:tblGrid>
         <w:gridCol w:w="1958"/>
@@ -4670,6 +4710,14 @@
         <w:tblStyle w:val="TableGrid"/>
         <w:tblW w:type="auto" w:w="0"/>
         <w:tblLook w:firstColumn="1" w:firstRow="1" w:lastColumn="0" w:lastRow="0" w:noHBand="0" w:noVBand="1" w:val="04A0"/>
+        <w:tblBorders>
+          <w:top w:val="single" w:sz="6" w:space="0" w:color="000000"/>
+          <w:left w:val="none" w:sz="0" w:space="0" w:color="auto"/>
+          <w:bottom w:val="single" w:sz="6" w:space="0" w:color="000000"/>
+          <w:right w:val="none" w:sz="0" w:space="0" w:color="auto"/>
+          <w:insideH w:val="single" w:sz="6" w:space="0" w:color="000000"/>
+          <w:insideV w:val="none" w:sz="0" w:space="0" w:color="auto"/>
+        </w:tblBorders>
       </w:tblPr>
       <w:tblGrid>
         <w:gridCol w:w="1958"/>
@@ -6406,6 +6454,14 @@
         <w:tblStyle w:val="TableGrid"/>
         <w:tblW w:type="auto" w:w="0"/>
         <w:tblLook w:firstColumn="1" w:firstRow="1" w:lastColumn="0" w:lastRow="0" w:noHBand="0" w:noVBand="1" w:val="04A0"/>
+        <w:tblBorders>
+          <w:top w:val="single" w:sz="6" w:space="0" w:color="000000"/>
+          <w:left w:val="none" w:sz="0" w:space="0" w:color="auto"/>
+          <w:bottom w:val="single" w:sz="6" w:space="0" w:color="000000"/>
+          <w:right w:val="none" w:sz="0" w:space="0" w:color="auto"/>
+          <w:insideH w:val="single" w:sz="6" w:space="0" w:color="000000"/>
+          <w:insideV w:val="none" w:sz="0" w:space="0" w:color="auto"/>
+        </w:tblBorders>
       </w:tblPr>
       <w:tblGrid>
         <w:gridCol w:w="1958"/>
@@ -7239,6 +7295,14 @@
         <w:tblStyle w:val="TableGrid"/>
         <w:tblW w:type="auto" w:w="0"/>
         <w:tblLook w:firstColumn="1" w:firstRow="1" w:lastColumn="0" w:lastRow="0" w:noHBand="0" w:noVBand="1" w:val="04A0"/>
+        <w:tblBorders>
+          <w:top w:val="single" w:sz="6" w:space="0" w:color="000000"/>
+          <w:left w:val="none" w:sz="0" w:space="0" w:color="auto"/>
+          <w:bottom w:val="single" w:sz="6" w:space="0" w:color="000000"/>
+          <w:right w:val="none" w:sz="0" w:space="0" w:color="auto"/>
+          <w:insideH w:val="single" w:sz="6" w:space="0" w:color="000000"/>
+          <w:insideV w:val="none" w:sz="0" w:space="0" w:color="auto"/>
+        </w:tblBorders>
       </w:tblPr>
       <w:tblGrid>
         <w:gridCol w:w="1958"/>
@@ -7393,6 +7457,14 @@
         <w:tblStyle w:val="TableGrid"/>
         <w:tblW w:type="auto" w:w="0"/>
         <w:tblLook w:firstColumn="1" w:firstRow="1" w:lastColumn="0" w:lastRow="0" w:noHBand="0" w:noVBand="1" w:val="04A0"/>
+        <w:tblBorders>
+          <w:top w:val="single" w:sz="6" w:space="0" w:color="000000"/>
+          <w:left w:val="none" w:sz="0" w:space="0" w:color="auto"/>
+          <w:bottom w:val="single" w:sz="6" w:space="0" w:color="000000"/>
+          <w:right w:val="none" w:sz="0" w:space="0" w:color="auto"/>
+          <w:insideH w:val="single" w:sz="6" w:space="0" w:color="000000"/>
+          <w:insideV w:val="none" w:sz="0" w:space="0" w:color="auto"/>
+        </w:tblBorders>
       </w:tblPr>
       <w:tblGrid>
         <w:gridCol w:w="1958"/>
@@ -7655,6 +7727,14 @@
         <w:tblStyle w:val="TableGrid"/>
         <w:tblW w:type="auto" w:w="0"/>
         <w:tblLook w:firstColumn="1" w:firstRow="1" w:lastColumn="0" w:lastRow="0" w:noHBand="0" w:noVBand="1" w:val="04A0"/>
+        <w:tblBorders>
+          <w:top w:val="single" w:sz="6" w:space="0" w:color="000000"/>
+          <w:left w:val="none" w:sz="0" w:space="0" w:color="auto"/>
+          <w:bottom w:val="single" w:sz="6" w:space="0" w:color="000000"/>
+          <w:right w:val="none" w:sz="0" w:space="0" w:color="auto"/>
+          <w:insideH w:val="single" w:sz="6" w:space="0" w:color="000000"/>
+          <w:insideV w:val="none" w:sz="0" w:space="0" w:color="auto"/>
+        </w:tblBorders>
       </w:tblPr>
       <w:tblGrid>
         <w:gridCol w:w="1958"/>
@@ -7818,6 +7898,14 @@
         <w:tblStyle w:val="TableGrid"/>
         <w:tblW w:type="auto" w:w="0"/>
         <w:tblLook w:firstColumn="1" w:firstRow="1" w:lastColumn="0" w:lastRow="0" w:noHBand="0" w:noVBand="1" w:val="04A0"/>
+        <w:tblBorders>
+          <w:top w:val="single" w:sz="6" w:space="0" w:color="000000"/>
+          <w:left w:val="none" w:sz="0" w:space="0" w:color="auto"/>
+          <w:bottom w:val="single" w:sz="6" w:space="0" w:color="000000"/>
+          <w:right w:val="none" w:sz="0" w:space="0" w:color="auto"/>
+          <w:insideH w:val="single" w:sz="6" w:space="0" w:color="000000"/>
+          <w:insideV w:val="none" w:sz="0" w:space="0" w:color="auto"/>
+        </w:tblBorders>
       </w:tblPr>
       <w:tblGrid>
         <w:gridCol w:w="1958"/>
@@ -8098,6 +8186,14 @@
         <w:tblStyle w:val="TableGrid"/>
         <w:tblW w:type="auto" w:w="0"/>
         <w:tblLook w:firstColumn="1" w:firstRow="1" w:lastColumn="0" w:lastRow="0" w:noHBand="0" w:noVBand="1" w:val="04A0"/>
+        <w:tblBorders>
+          <w:top w:val="single" w:sz="6" w:space="0" w:color="000000"/>
+          <w:left w:val="none" w:sz="0" w:space="0" w:color="auto"/>
+          <w:bottom w:val="single" w:sz="6" w:space="0" w:color="000000"/>
+          <w:right w:val="none" w:sz="0" w:space="0" w:color="auto"/>
+          <w:insideH w:val="single" w:sz="6" w:space="0" w:color="000000"/>
+          <w:insideV w:val="none" w:sz="0" w:space="0" w:color="auto"/>
+        </w:tblBorders>
       </w:tblPr>
       <w:tblGrid>
         <w:gridCol w:w="1958"/>
@@ -8719,33 +8815,46 @@
               <w:rPr>
                 <w:sz w:val="16"/>
               </w:rPr>
-              <w:t>；公式已按 (1)–(5) 编号。</w:t>
+              <w:t>；公式已按 (1)–(5) 编号。已完成排版项：公式为 Word 原生公式（每稿 5 个 OMML，无 LaTeX 残留，</w:t>
+            </w:r>
+            <w:r>
+              <w:rPr>
+                <w:rFonts w:ascii="Consolas" w:hAnsi="Consolas"/>
+                <w:sz w:val="16"/>
+              </w:rPr>
+              <w:t>scripts/convert_equations_word_v41.py</w:t>
+            </w:r>
+            <w:r>
+              <w:rPr>
+                <w:sz w:val="16"/>
+              </w:rPr>
+              <w:t>）、表格改为三线表去竖线（10 张表逐张核对 XML）、斜体标记正确渲染、编号列表每表独立计数（</w:t>
+            </w:r>
+            <w:r>
+              <w:rPr>
+                <w:rFonts w:ascii="Consolas" w:hAnsi="Consolas"/>
+                <w:sz w:val="16"/>
+              </w:rPr>
+              <w:t>scripts/check_docx_numbering_v40.py</w:t>
+            </w:r>
+            <w:r>
+              <w:rPr>
+                <w:sz w:val="16"/>
+              </w:rPr>
+              <w:t>，Word 渲染核验）。</w:t>
             </w:r>
             <w:r>
               <w:rPr>
                 <w:b/>
                 <w:sz w:val="16"/>
               </w:rPr>
-              <w:t>尚余排版项</w:t>
-            </w:r>
-            <w:r>
-              <w:rPr>
-                <w:sz w:val="16"/>
-              </w:rPr>
-              <w:t>：① 套用 JISA 官方模板（单栏）；② 用 Word 公式编辑器的 LaTeX 模式把 5 个公式从 LaTeX 源码转为原生公式；③ 表格改为仅横线（本刊要求避免竖线）；④ 填入作者与单位信息；编号列表已改为每表独立计数（</w:t>
-            </w:r>
-            <w:r>
-              <w:rPr>
-                <w:rFonts w:ascii="Consolas" w:hAnsi="Consolas"/>
-                <w:sz w:val="16"/>
-              </w:rPr>
-              <w:t>scripts/check_docx_numbering_v40.py</w:t>
-            </w:r>
-            <w:r>
-              <w:rPr>
-                <w:sz w:val="16"/>
-              </w:rPr>
-              <w:t>，Word 渲染核验）</w:t>
+              <w:t>仅余两项需作者参与</w:t>
+            </w:r>
+            <w:r>
+              <w:rPr>
+                <w:sz w:val="16"/>
+              </w:rPr>
+              <w:t>：① 套用投稿当天的 JISA 官方模板；② 填入作者、单位与通信信息</w:t>
             </w:r>
           </w:p>
         </w:tc>
@@ -8783,6 +8892,14 @@
         <w:tblStyle w:val="TableGrid"/>
         <w:tblW w:type="auto" w:w="0"/>
         <w:tblLook w:firstColumn="1" w:firstRow="1" w:lastColumn="0" w:lastRow="0" w:noHBand="0" w:noVBand="1" w:val="04A0"/>
+        <w:tblBorders>
+          <w:top w:val="single" w:sz="6" w:space="0" w:color="000000"/>
+          <w:left w:val="none" w:sz="0" w:space="0" w:color="auto"/>
+          <w:bottom w:val="single" w:sz="6" w:space="0" w:color="000000"/>
+          <w:right w:val="none" w:sz="0" w:space="0" w:color="auto"/>
+          <w:insideH w:val="single" w:sz="6" w:space="0" w:color="000000"/>
+          <w:insideV w:val="none" w:sz="0" w:space="0" w:color="auto"/>
+        </w:tblBorders>
       </w:tblPr>
       <w:tblGrid>
         <w:gridCol w:w="1958"/>
@@ -9710,6 +9827,14 @@
         <w:tblStyle w:val="TableGrid"/>
         <w:tblW w:type="auto" w:w="0"/>
         <w:tblLook w:firstColumn="1" w:firstRow="1" w:lastColumn="0" w:lastRow="0" w:noHBand="0" w:noVBand="1" w:val="04A0"/>
+        <w:tblBorders>
+          <w:top w:val="single" w:sz="6" w:space="0" w:color="000000"/>
+          <w:left w:val="none" w:sz="0" w:space="0" w:color="auto"/>
+          <w:bottom w:val="single" w:sz="6" w:space="0" w:color="000000"/>
+          <w:right w:val="none" w:sz="0" w:space="0" w:color="auto"/>
+          <w:insideH w:val="single" w:sz="6" w:space="0" w:color="000000"/>
+          <w:insideV w:val="none" w:sz="0" w:space="0" w:color="auto"/>
+        </w:tblBorders>
       </w:tblPr>
       <w:tblGrid>
         <w:gridCol w:w="2448"/>
@@ -10267,6 +10392,14 @@
         <w:tblStyle w:val="TableGrid"/>
         <w:tblW w:type="auto" w:w="0"/>
         <w:tblLook w:firstColumn="1" w:firstRow="1" w:lastColumn="0" w:lastRow="0" w:noHBand="0" w:noVBand="1" w:val="04A0"/>
+        <w:tblBorders>
+          <w:top w:val="single" w:sz="6" w:space="0" w:color="000000"/>
+          <w:left w:val="none" w:sz="0" w:space="0" w:color="auto"/>
+          <w:bottom w:val="single" w:sz="6" w:space="0" w:color="000000"/>
+          <w:right w:val="none" w:sz="0" w:space="0" w:color="auto"/>
+          <w:insideH w:val="single" w:sz="6" w:space="0" w:color="000000"/>
+          <w:insideV w:val="none" w:sz="0" w:space="0" w:color="auto"/>
+        </w:tblBorders>
       </w:tblPr>
       <w:tblGrid>
         <w:gridCol w:w="2448"/>

</xml_diff>

<commit_message>
Round 17: verify figure annotations and figure reproducibility
</commit_message>
<xml_diff>
--- a/重构版论文_v4_20260915/论文自查表.docx
+++ b/重构版论文_v4_20260915/论文自查表.docx
@@ -6908,7 +6908,33 @@
               <w:rPr>
                 <w:sz w:val="16"/>
               </w:rPr>
-              <w:t>11 图 7 表；图 4 图注明确说明纵轴起点 0.75 并提示需与区间面板合读</w:t>
+              <w:t>11 图 7 表；图 4 图注明确说明纵轴起点 0.75 并提示需与区间面板合读；</w:t>
+            </w:r>
+            <w:r>
+              <w:rPr>
+                <w:rFonts w:ascii="Consolas" w:hAnsi="Consolas"/>
+                <w:sz w:val="16"/>
+              </w:rPr>
+              <w:t>check_figure_annotations_v44.py</w:t>
+            </w:r>
+            <w:r>
+              <w:rPr>
+                <w:sz w:val="16"/>
+              </w:rPr>
+              <w:t xml:space="preserve"> 校验图注数值与正文一致，</w:t>
+            </w:r>
+            <w:r>
+              <w:rPr>
+                <w:rFonts w:ascii="Consolas" w:hAnsi="Consolas"/>
+                <w:sz w:val="16"/>
+              </w:rPr>
+              <w:t>check_figure_reproducibility_v45.py</w:t>
+            </w:r>
+            <w:r>
+              <w:rPr>
+                <w:sz w:val="16"/>
+              </w:rPr>
+              <w:t xml:space="preserve"> 逐字节确认插图可由当前代码复现</w:t>
             </w:r>
           </w:p>
         </w:tc>

</xml_diff>